<commit_message>
Update collaborations list, add new collaborator images, and link Weiwen Wang's picture
</commit_message>
<xml_diff>
--- a/Collaborations.docx
+++ b/Collaborations.docx
@@ -1710,6 +1710,631 @@
                 <w:szCs w:val="22"/>
               </w:rPr>
               <w:t>Australia</w:t>
+            </w:r>
+          </w:p>
+        </w:tc>
+      </w:tr>
+      <w:tr>
+        <w:tc>
+          <w:tcPr>
+            <w:tcW w:w="2689" w:type="dxa"/>
+          </w:tcPr>
+          <w:p>
+            <w:pPr>
+              <w:rPr>
+                <w:sz w:val="22"/>
+                <w:szCs w:val="22"/>
+              </w:rPr>
+            </w:pPr>
+            <w:r>
+              <w:rPr>
+                <w:sz w:val="22"/>
+                <w:szCs w:val="22"/>
+              </w:rPr>
+              <w:t>Dr Andrea Cesura</w:t>
+            </w:r>
+          </w:p>
+        </w:tc>
+        <w:tc>
+          <w:tcPr>
+            <w:tcW w:w="3118" w:type="dxa"/>
+          </w:tcPr>
+          <w:p>
+            <w:pPr>
+              <w:rPr>
+                <w:sz w:val="22"/>
+                <w:szCs w:val="22"/>
+              </w:rPr>
+            </w:pPr>
+            <w:r>
+              <w:rPr>
+                <w:sz w:val="22"/>
+                <w:szCs w:val="22"/>
+              </w:rPr>
+              <w:t xml:space="preserve">Independent </w:t>
+            </w:r>
+            <w:r>
+              <w:rPr>
+                <w:sz w:val="22"/>
+                <w:szCs w:val="22"/>
+              </w:rPr>
+              <w:t>Consultant</w:t>
+            </w:r>
+          </w:p>
+        </w:tc>
+        <w:tc>
+          <w:tcPr>
+            <w:tcW w:w="1418" w:type="dxa"/>
+          </w:tcPr>
+          <w:p>
+            <w:pPr>
+              <w:rPr>
+                <w:sz w:val="22"/>
+                <w:szCs w:val="22"/>
+              </w:rPr>
+            </w:pPr>
+            <w:r>
+              <w:rPr>
+                <w:sz w:val="22"/>
+                <w:szCs w:val="22"/>
+              </w:rPr>
+              <w:t>Gen</w:t>
+            </w:r>
+            <w:r>
+              <w:rPr>
+                <w:sz w:val="22"/>
+                <w:szCs w:val="22"/>
+              </w:rPr>
+              <w:t>e</w:t>
+            </w:r>
+            <w:r>
+              <w:rPr>
+                <w:sz w:val="22"/>
+                <w:szCs w:val="22"/>
+              </w:rPr>
+              <w:t>va</w:t>
+            </w:r>
+          </w:p>
+        </w:tc>
+        <w:tc>
+          <w:tcPr>
+            <w:tcW w:w="1791" w:type="dxa"/>
+          </w:tcPr>
+          <w:p>
+            <w:pPr>
+              <w:rPr>
+                <w:sz w:val="22"/>
+                <w:szCs w:val="22"/>
+              </w:rPr>
+            </w:pPr>
+            <w:r>
+              <w:rPr>
+                <w:sz w:val="22"/>
+                <w:szCs w:val="22"/>
+              </w:rPr>
+              <w:t>Switzerland</w:t>
+            </w:r>
+          </w:p>
+        </w:tc>
+      </w:tr>
+      <w:tr>
+        <w:tc>
+          <w:tcPr>
+            <w:tcW w:w="2689" w:type="dxa"/>
+          </w:tcPr>
+          <w:p>
+            <w:pPr>
+              <w:rPr>
+                <w:sz w:val="22"/>
+                <w:szCs w:val="22"/>
+              </w:rPr>
+            </w:pPr>
+            <w:r>
+              <w:rPr>
+                <w:sz w:val="22"/>
+                <w:szCs w:val="22"/>
+              </w:rPr>
+              <w:t>Dr Mark Gemkow</w:t>
+            </w:r>
+          </w:p>
+        </w:tc>
+        <w:tc>
+          <w:tcPr>
+            <w:tcW w:w="3118" w:type="dxa"/>
+          </w:tcPr>
+          <w:p>
+            <w:pPr>
+              <w:rPr>
+                <w:sz w:val="22"/>
+                <w:szCs w:val="22"/>
+              </w:rPr>
+            </w:pPr>
+            <w:r>
+              <w:rPr>
+                <w:sz w:val="22"/>
+                <w:szCs w:val="22"/>
+              </w:rPr>
+              <w:t>Evotec</w:t>
+            </w:r>
+          </w:p>
+        </w:tc>
+        <w:tc>
+          <w:tcPr>
+            <w:tcW w:w="1418" w:type="dxa"/>
+          </w:tcPr>
+          <w:p>
+            <w:pPr>
+              <w:rPr>
+                <w:sz w:val="22"/>
+                <w:szCs w:val="22"/>
+              </w:rPr>
+            </w:pPr>
+            <w:r>
+              <w:rPr>
+                <w:sz w:val="22"/>
+                <w:szCs w:val="22"/>
+              </w:rPr>
+              <w:t>Hamburg</w:t>
+            </w:r>
+          </w:p>
+        </w:tc>
+        <w:tc>
+          <w:tcPr>
+            <w:tcW w:w="1791" w:type="dxa"/>
+          </w:tcPr>
+          <w:p>
+            <w:pPr>
+              <w:rPr>
+                <w:sz w:val="22"/>
+                <w:szCs w:val="22"/>
+              </w:rPr>
+            </w:pPr>
+            <w:r>
+              <w:rPr>
+                <w:sz w:val="22"/>
+                <w:szCs w:val="22"/>
+              </w:rPr>
+              <w:t>Germany</w:t>
+            </w:r>
+          </w:p>
+        </w:tc>
+      </w:tr>
+      <w:tr>
+        <w:tc>
+          <w:tcPr>
+            <w:tcW w:w="2689" w:type="dxa"/>
+          </w:tcPr>
+          <w:p>
+            <w:pPr>
+              <w:rPr>
+                <w:sz w:val="22"/>
+                <w:szCs w:val="22"/>
+              </w:rPr>
+            </w:pPr>
+            <w:r>
+              <w:rPr>
+                <w:sz w:val="22"/>
+                <w:szCs w:val="22"/>
+              </w:rPr>
+              <w:t>Dr Eric Prinssen</w:t>
+            </w:r>
+          </w:p>
+        </w:tc>
+        <w:tc>
+          <w:tcPr>
+            <w:tcW w:w="3118" w:type="dxa"/>
+          </w:tcPr>
+          <w:p>
+            <w:pPr>
+              <w:rPr>
+                <w:sz w:val="22"/>
+                <w:szCs w:val="22"/>
+              </w:rPr>
+            </w:pPr>
+            <w:r>
+              <w:rPr>
+                <w:sz w:val="22"/>
+                <w:szCs w:val="22"/>
+              </w:rPr>
+              <w:t>Roche</w:t>
+            </w:r>
+          </w:p>
+        </w:tc>
+        <w:tc>
+          <w:tcPr>
+            <w:tcW w:w="1418" w:type="dxa"/>
+          </w:tcPr>
+          <w:p>
+            <w:pPr>
+              <w:rPr>
+                <w:sz w:val="22"/>
+                <w:szCs w:val="22"/>
+              </w:rPr>
+            </w:pPr>
+            <w:r>
+              <w:rPr>
+                <w:sz w:val="22"/>
+                <w:szCs w:val="22"/>
+              </w:rPr>
+              <w:t>Basel</w:t>
+            </w:r>
+          </w:p>
+        </w:tc>
+        <w:tc>
+          <w:tcPr>
+            <w:tcW w:w="1791" w:type="dxa"/>
+          </w:tcPr>
+          <w:p>
+            <w:pPr>
+              <w:rPr>
+                <w:sz w:val="22"/>
+                <w:szCs w:val="22"/>
+              </w:rPr>
+            </w:pPr>
+            <w:r>
+              <w:rPr>
+                <w:sz w:val="22"/>
+                <w:szCs w:val="22"/>
+              </w:rPr>
+              <w:t>Germany</w:t>
+            </w:r>
+          </w:p>
+        </w:tc>
+      </w:tr>
+      <w:tr>
+        <w:tc>
+          <w:tcPr>
+            <w:tcW w:w="2689" w:type="dxa"/>
+          </w:tcPr>
+          <w:p>
+            <w:pPr>
+              <w:rPr>
+                <w:sz w:val="22"/>
+                <w:szCs w:val="22"/>
+              </w:rPr>
+            </w:pPr>
+            <w:r>
+              <w:rPr>
+                <w:sz w:val="22"/>
+                <w:szCs w:val="22"/>
+              </w:rPr>
+              <w:t>Dr Yah-se Abada</w:t>
+            </w:r>
+          </w:p>
+        </w:tc>
+        <w:tc>
+          <w:tcPr>
+            <w:tcW w:w="3118" w:type="dxa"/>
+          </w:tcPr>
+          <w:p>
+            <w:pPr>
+              <w:rPr>
+                <w:sz w:val="22"/>
+                <w:szCs w:val="22"/>
+              </w:rPr>
+            </w:pPr>
+            <w:r>
+              <w:rPr>
+                <w:sz w:val="22"/>
+                <w:szCs w:val="22"/>
+              </w:rPr>
+              <w:t>Universit</w:t>
+            </w:r>
+            <w:r>
+              <w:rPr>
+                <w:sz w:val="22"/>
+                <w:szCs w:val="22"/>
+              </w:rPr>
+              <w:t>y</w:t>
+            </w:r>
+            <w:r>
+              <w:rPr>
+                <w:sz w:val="22"/>
+                <w:szCs w:val="22"/>
+              </w:rPr>
+              <w:t xml:space="preserve"> </w:t>
+            </w:r>
+            <w:proofErr w:type="spellStart"/>
+            <w:r>
+              <w:rPr>
+                <w:sz w:val="22"/>
+                <w:szCs w:val="22"/>
+              </w:rPr>
+              <w:t>Pitié</w:t>
+            </w:r>
+            <w:proofErr w:type="spellEnd"/>
+            <w:r>
+              <w:rPr>
+                <w:sz w:val="22"/>
+                <w:szCs w:val="22"/>
+              </w:rPr>
+              <w:t xml:space="preserve"> Salpêtrière</w:t>
+            </w:r>
+          </w:p>
+        </w:tc>
+        <w:tc>
+          <w:tcPr>
+            <w:tcW w:w="1418" w:type="dxa"/>
+          </w:tcPr>
+          <w:p>
+            <w:pPr>
+              <w:rPr>
+                <w:sz w:val="22"/>
+                <w:szCs w:val="22"/>
+              </w:rPr>
+            </w:pPr>
+            <w:r>
+              <w:rPr>
+                <w:sz w:val="22"/>
+                <w:szCs w:val="22"/>
+              </w:rPr>
+              <w:t>Paris</w:t>
+            </w:r>
+          </w:p>
+        </w:tc>
+        <w:tc>
+          <w:tcPr>
+            <w:tcW w:w="1791" w:type="dxa"/>
+          </w:tcPr>
+          <w:p>
+            <w:pPr>
+              <w:rPr>
+                <w:sz w:val="22"/>
+                <w:szCs w:val="22"/>
+              </w:rPr>
+            </w:pPr>
+            <w:r>
+              <w:rPr>
+                <w:sz w:val="22"/>
+                <w:szCs w:val="22"/>
+              </w:rPr>
+              <w:t>France</w:t>
+            </w:r>
+          </w:p>
+        </w:tc>
+      </w:tr>
+      <w:tr>
+        <w:tc>
+          <w:tcPr>
+            <w:tcW w:w="2689" w:type="dxa"/>
+          </w:tcPr>
+          <w:p>
+            <w:pPr>
+              <w:rPr>
+                <w:sz w:val="22"/>
+                <w:szCs w:val="22"/>
+              </w:rPr>
+            </w:pPr>
+            <w:r>
+              <w:rPr>
+                <w:sz w:val="22"/>
+                <w:szCs w:val="22"/>
+              </w:rPr>
+              <w:t>Prof Mark Geyer</w:t>
+            </w:r>
+          </w:p>
+        </w:tc>
+        <w:tc>
+          <w:tcPr>
+            <w:tcW w:w="3118" w:type="dxa"/>
+          </w:tcPr>
+          <w:p>
+            <w:pPr>
+              <w:rPr>
+                <w:sz w:val="22"/>
+                <w:szCs w:val="22"/>
+              </w:rPr>
+            </w:pPr>
+            <w:r>
+              <w:rPr>
+                <w:sz w:val="22"/>
+                <w:szCs w:val="22"/>
+              </w:rPr>
+              <w:t>University San Diego</w:t>
+            </w:r>
+          </w:p>
+        </w:tc>
+        <w:tc>
+          <w:tcPr>
+            <w:tcW w:w="1418" w:type="dxa"/>
+          </w:tcPr>
+          <w:p>
+            <w:pPr>
+              <w:rPr>
+                <w:sz w:val="22"/>
+                <w:szCs w:val="22"/>
+              </w:rPr>
+            </w:pPr>
+            <w:r>
+              <w:rPr>
+                <w:sz w:val="22"/>
+                <w:szCs w:val="22"/>
+              </w:rPr>
+              <w:t>San Diego</w:t>
+            </w:r>
+          </w:p>
+        </w:tc>
+        <w:tc>
+          <w:tcPr>
+            <w:tcW w:w="1791" w:type="dxa"/>
+          </w:tcPr>
+          <w:p>
+            <w:pPr>
+              <w:rPr>
+                <w:sz w:val="22"/>
+                <w:szCs w:val="22"/>
+              </w:rPr>
+            </w:pPr>
+            <w:r>
+              <w:rPr>
+                <w:sz w:val="22"/>
+                <w:szCs w:val="22"/>
+              </w:rPr>
+              <w:t>USA</w:t>
+            </w:r>
+          </w:p>
+        </w:tc>
+      </w:tr>
+      <w:tr>
+        <w:tc>
+          <w:tcPr>
+            <w:tcW w:w="2689" w:type="dxa"/>
+          </w:tcPr>
+          <w:p>
+            <w:pPr>
+              <w:rPr>
+                <w:sz w:val="22"/>
+                <w:szCs w:val="22"/>
+              </w:rPr>
+            </w:pPr>
+            <w:r>
+              <w:rPr>
+                <w:sz w:val="22"/>
+                <w:szCs w:val="22"/>
+              </w:rPr>
+              <w:t>Prof Martin Paulus</w:t>
+            </w:r>
+          </w:p>
+        </w:tc>
+        <w:tc>
+          <w:tcPr>
+            <w:tcW w:w="3118" w:type="dxa"/>
+          </w:tcPr>
+          <w:p>
+            <w:pPr>
+              <w:rPr>
+                <w:sz w:val="22"/>
+                <w:szCs w:val="22"/>
+              </w:rPr>
+            </w:pPr>
+            <w:r>
+              <w:rPr>
+                <w:sz w:val="22"/>
+                <w:szCs w:val="22"/>
+              </w:rPr>
+              <w:t>Laureate Institute</w:t>
+            </w:r>
+          </w:p>
+        </w:tc>
+        <w:tc>
+          <w:tcPr>
+            <w:tcW w:w="1418" w:type="dxa"/>
+          </w:tcPr>
+          <w:p>
+            <w:pPr>
+              <w:rPr>
+                <w:sz w:val="22"/>
+                <w:szCs w:val="22"/>
+              </w:rPr>
+            </w:pPr>
+            <w:r>
+              <w:rPr>
+                <w:sz w:val="22"/>
+                <w:szCs w:val="22"/>
+              </w:rPr>
+              <w:t>Tulsa</w:t>
+            </w:r>
+          </w:p>
+        </w:tc>
+        <w:tc>
+          <w:tcPr>
+            <w:tcW w:w="1791" w:type="dxa"/>
+          </w:tcPr>
+          <w:p>
+            <w:pPr>
+              <w:rPr>
+                <w:sz w:val="22"/>
+                <w:szCs w:val="22"/>
+              </w:rPr>
+            </w:pPr>
+            <w:r>
+              <w:rPr>
+                <w:sz w:val="22"/>
+                <w:szCs w:val="22"/>
+              </w:rPr>
+              <w:t>USA</w:t>
+            </w:r>
+          </w:p>
+        </w:tc>
+      </w:tr>
+      <w:tr>
+        <w:tc>
+          <w:tcPr>
+            <w:tcW w:w="2689" w:type="dxa"/>
+          </w:tcPr>
+          <w:p>
+            <w:pPr>
+              <w:rPr>
+                <w:sz w:val="22"/>
+                <w:szCs w:val="22"/>
+              </w:rPr>
+            </w:pPr>
+            <w:r>
+              <w:rPr>
+                <w:sz w:val="22"/>
+                <w:szCs w:val="22"/>
+              </w:rPr>
+              <w:t>Prof Marco Riva</w:t>
+            </w:r>
+          </w:p>
+        </w:tc>
+        <w:tc>
+          <w:tcPr>
+            <w:tcW w:w="3118" w:type="dxa"/>
+          </w:tcPr>
+          <w:p>
+            <w:pPr>
+              <w:rPr>
+                <w:sz w:val="22"/>
+                <w:szCs w:val="22"/>
+              </w:rPr>
+            </w:pPr>
+            <w:r>
+              <w:rPr>
+                <w:sz w:val="22"/>
+                <w:szCs w:val="22"/>
+              </w:rPr>
+              <w:t>University of Milan</w:t>
+            </w:r>
+          </w:p>
+        </w:tc>
+        <w:tc>
+          <w:tcPr>
+            <w:tcW w:w="1418" w:type="dxa"/>
+          </w:tcPr>
+          <w:p>
+            <w:pPr>
+              <w:rPr>
+                <w:sz w:val="22"/>
+                <w:szCs w:val="22"/>
+              </w:rPr>
+            </w:pPr>
+            <w:r>
+              <w:rPr>
+                <w:sz w:val="22"/>
+                <w:szCs w:val="22"/>
+              </w:rPr>
+              <w:t>Milan</w:t>
+            </w:r>
+          </w:p>
+        </w:tc>
+        <w:tc>
+          <w:tcPr>
+            <w:tcW w:w="1791" w:type="dxa"/>
+          </w:tcPr>
+          <w:p>
+            <w:pPr>
+              <w:rPr>
+                <w:sz w:val="22"/>
+                <w:szCs w:val="22"/>
+              </w:rPr>
+            </w:pPr>
+            <w:r>
+              <w:rPr>
+                <w:sz w:val="22"/>
+                <w:szCs w:val="22"/>
+              </w:rPr>
+              <w:t>Italy</w:t>
             </w:r>
           </w:p>
         </w:tc>
@@ -2200,7 +2825,6 @@
     <w:next w:val="Normal"/>
     <w:link w:val="Heading4Char"/>
     <w:uiPriority w:val="9"/>
-    <w:semiHidden/>
     <w:unhideWhenUsed/>
     <w:qFormat/>
     <w:rsid w:val="00023B83"/>
@@ -2399,7 +3023,6 @@
     <w:basedOn w:val="DefaultParagraphFont"/>
     <w:link w:val="Heading4"/>
     <w:uiPriority w:val="9"/>
-    <w:semiHidden/>
     <w:rsid w:val="00023B83"/>
     <w:rPr>
       <w:rFonts w:eastAsiaTheme="majorEastAsia" w:cstheme="majorBidi"/>

</xml_diff>